<commit_message>
review feedback: src layout, eda section, rebuilt report and docs
</commit_message>
<xml_diff>
--- a/reports/TMDB_Movie_Data_Analysis_Report.docx
+++ b/reports/TMDB_Movie_Data_Analysis_Report.docx
@@ -5,21 +5,13 @@
     <w:p>
       <w:pPr>
         <w:pStyle w:val="Title"/>
-        <w:jc w:val="center"/>
       </w:pPr>
       <w:r>
         <w:t>TMDB Movie Data Analysis using Pandas and APIs</w:t>
       </w:r>
     </w:p>
     <w:p>
-      <w:pPr>
-        <w:jc w:val="center"/>
-      </w:pPr>
       <w:r>
-        <w:rPr>
-          <w:i/>
-          <w:sz w:val="22"/>
-        </w:rPr>
         <w:t>18 films from the TMDB api, cleaned, ranked and charted</w:t>
       </w:r>
     </w:p>
@@ -33,7 +25,7 @@
     </w:p>
     <w:p>
       <w:r>
-        <w:t>I asked TMDB for 19 movie ids, cleaned what came back into a single analysis table, worked out profit and roi, ranked the set ten ways, ran two cast searches, compared franchises against standalones, and drew 5 charts. Everything below is produced by the code in this repo.</w:t>
+        <w:t>I asked TMDB for 19 movie ids, cleaned what came back into a single analysis table, worked out profit and roi, ranked the set ten ways, ran two cast searches, compared franchises against standalones, looked at the distributions and outliers behind those numbers, and drew 8 charts. Everything below is produced by the code in this repo.</w:t>
       </w:r>
     </w:p>
     <w:p>
@@ -139,7 +131,7 @@
         <w:pStyle w:val="ListBullet"/>
       </w:pPr>
       <w:r>
-        <w:t>Added profit and roi, then ranked ten ways, searched twice, grouped franchise against standalone, and drew the charts.</w:t>
+        <w:t>Added profit and roi, then ranked ten ways, searched twice, grouped franchise against standalone, described the numeric columns, histogrammed and boxplotted the ones the kpis rest on, and drew the charts.</w:t>
       </w:r>
     </w:p>
     <w:p>
@@ -226,79 +218,59 @@
         <w:tblLook w:firstColumn="1" w:firstRow="1" w:lastColumn="0" w:lastRow="0" w:noHBand="0" w:noVBand="1" w:val="04A0"/>
       </w:tblPr>
       <w:tblGrid>
-        <w:gridCol w:w="1958"/>
-        <w:gridCol w:w="1958"/>
-        <w:gridCol w:w="1958"/>
-        <w:gridCol w:w="1958"/>
-        <w:gridCol w:w="1958"/>
+        <w:gridCol w:w="1728"/>
+        <w:gridCol w:w="1728"/>
+        <w:gridCol w:w="1728"/>
+        <w:gridCol w:w="1728"/>
+        <w:gridCol w:w="1728"/>
       </w:tblGrid>
       <w:tr>
         <w:tc>
           <w:tcPr>
-            <w:tcW w:type="dxa" w:w="1944"/>
+            <w:tcW w:type="dxa" w:w="1728"/>
           </w:tcPr>
           <w:p>
-            <w:r/>
             <w:r>
-              <w:rPr>
-                <w:b/>
-              </w:rPr>
               <w:t>ranking</w:t>
             </w:r>
           </w:p>
         </w:tc>
         <w:tc>
           <w:tcPr>
-            <w:tcW w:type="dxa" w:w="1440"/>
+            <w:tcW w:type="dxa" w:w="1728"/>
           </w:tcPr>
           <w:p>
-            <w:r/>
             <w:r>
-              <w:rPr>
-                <w:b/>
-              </w:rPr>
               <w:t>filter</w:t>
             </w:r>
           </w:p>
         </w:tc>
         <w:tc>
           <w:tcPr>
-            <w:tcW w:type="dxa" w:w="2160"/>
+            <w:tcW w:type="dxa" w:w="1728"/>
           </w:tcPr>
           <w:p>
-            <w:r/>
             <w:r>
-              <w:rPr>
-                <w:b/>
-              </w:rPr>
               <w:t>1st</w:t>
             </w:r>
           </w:p>
         </w:tc>
         <w:tc>
           <w:tcPr>
-            <w:tcW w:type="dxa" w:w="2016"/>
+            <w:tcW w:type="dxa" w:w="1728"/>
           </w:tcPr>
           <w:p>
-            <w:r/>
             <w:r>
-              <w:rPr>
-                <w:b/>
-              </w:rPr>
               <w:t>2nd</w:t>
             </w:r>
           </w:p>
         </w:tc>
         <w:tc>
           <w:tcPr>
-            <w:tcW w:type="dxa" w:w="2016"/>
+            <w:tcW w:type="dxa" w:w="1728"/>
           </w:tcPr>
           <w:p>
-            <w:r/>
             <w:r>
-              <w:rPr>
-                <w:b/>
-              </w:rPr>
               <w:t>3rd</w:t>
             </w:r>
           </w:p>
@@ -307,7 +279,7 @@
       <w:tr>
         <w:tc>
           <w:tcPr>
-            <w:tcW w:type="dxa" w:w="1944"/>
+            <w:tcW w:type="dxa" w:w="1728"/>
           </w:tcPr>
           <w:p>
             <w:r>
@@ -317,7 +289,7 @@
         </w:tc>
         <w:tc>
           <w:tcPr>
-            <w:tcW w:type="dxa" w:w="1440"/>
+            <w:tcW w:type="dxa" w:w="1728"/>
           </w:tcPr>
           <w:p>
             <w:r>
@@ -327,7 +299,7 @@
         </w:tc>
         <w:tc>
           <w:tcPr>
-            <w:tcW w:type="dxa" w:w="2160"/>
+            <w:tcW w:type="dxa" w:w="1728"/>
           </w:tcPr>
           <w:p>
             <w:r>
@@ -337,7 +309,7 @@
         </w:tc>
         <w:tc>
           <w:tcPr>
-            <w:tcW w:type="dxa" w:w="2016"/>
+            <w:tcW w:type="dxa" w:w="1728"/>
           </w:tcPr>
           <w:p>
             <w:r>
@@ -347,7 +319,7 @@
         </w:tc>
         <w:tc>
           <w:tcPr>
-            <w:tcW w:type="dxa" w:w="2016"/>
+            <w:tcW w:type="dxa" w:w="1728"/>
           </w:tcPr>
           <w:p>
             <w:r>
@@ -359,7 +331,7 @@
       <w:tr>
         <w:tc>
           <w:tcPr>
-            <w:tcW w:type="dxa" w:w="1944"/>
+            <w:tcW w:type="dxa" w:w="1728"/>
           </w:tcPr>
           <w:p>
             <w:r>
@@ -369,7 +341,7 @@
         </w:tc>
         <w:tc>
           <w:tcPr>
-            <w:tcW w:type="dxa" w:w="1440"/>
+            <w:tcW w:type="dxa" w:w="1728"/>
           </w:tcPr>
           <w:p>
             <w:r>
@@ -379,7 +351,7 @@
         </w:tc>
         <w:tc>
           <w:tcPr>
-            <w:tcW w:type="dxa" w:w="2160"/>
+            <w:tcW w:type="dxa" w:w="1728"/>
           </w:tcPr>
           <w:p>
             <w:r>
@@ -389,7 +361,7 @@
         </w:tc>
         <w:tc>
           <w:tcPr>
-            <w:tcW w:type="dxa" w:w="2016"/>
+            <w:tcW w:type="dxa" w:w="1728"/>
           </w:tcPr>
           <w:p>
             <w:r>
@@ -399,7 +371,7 @@
         </w:tc>
         <w:tc>
           <w:tcPr>
-            <w:tcW w:type="dxa" w:w="2016"/>
+            <w:tcW w:type="dxa" w:w="1728"/>
           </w:tcPr>
           <w:p>
             <w:r>
@@ -411,7 +383,7 @@
       <w:tr>
         <w:tc>
           <w:tcPr>
-            <w:tcW w:type="dxa" w:w="1944"/>
+            <w:tcW w:type="dxa" w:w="1728"/>
           </w:tcPr>
           <w:p>
             <w:r>
@@ -421,7 +393,7 @@
         </w:tc>
         <w:tc>
           <w:tcPr>
-            <w:tcW w:type="dxa" w:w="1440"/>
+            <w:tcW w:type="dxa" w:w="1728"/>
           </w:tcPr>
           <w:p>
             <w:r>
@@ -431,7 +403,7 @@
         </w:tc>
         <w:tc>
           <w:tcPr>
-            <w:tcW w:type="dxa" w:w="2160"/>
+            <w:tcW w:type="dxa" w:w="1728"/>
           </w:tcPr>
           <w:p>
             <w:r>
@@ -441,7 +413,7 @@
         </w:tc>
         <w:tc>
           <w:tcPr>
-            <w:tcW w:type="dxa" w:w="2016"/>
+            <w:tcW w:type="dxa" w:w="1728"/>
           </w:tcPr>
           <w:p>
             <w:r>
@@ -451,7 +423,7 @@
         </w:tc>
         <w:tc>
           <w:tcPr>
-            <w:tcW w:type="dxa" w:w="2016"/>
+            <w:tcW w:type="dxa" w:w="1728"/>
           </w:tcPr>
           <w:p>
             <w:r>
@@ -463,7 +435,7 @@
       <w:tr>
         <w:tc>
           <w:tcPr>
-            <w:tcW w:type="dxa" w:w="1944"/>
+            <w:tcW w:type="dxa" w:w="1728"/>
           </w:tcPr>
           <w:p>
             <w:r>
@@ -473,7 +445,7 @@
         </w:tc>
         <w:tc>
           <w:tcPr>
-            <w:tcW w:type="dxa" w:w="1440"/>
+            <w:tcW w:type="dxa" w:w="1728"/>
           </w:tcPr>
           <w:p>
             <w:r>
@@ -483,7 +455,7 @@
         </w:tc>
         <w:tc>
           <w:tcPr>
-            <w:tcW w:type="dxa" w:w="2160"/>
+            <w:tcW w:type="dxa" w:w="1728"/>
           </w:tcPr>
           <w:p>
             <w:r>
@@ -493,7 +465,7 @@
         </w:tc>
         <w:tc>
           <w:tcPr>
-            <w:tcW w:type="dxa" w:w="2016"/>
+            <w:tcW w:type="dxa" w:w="1728"/>
           </w:tcPr>
           <w:p>
             <w:r>
@@ -503,7 +475,7 @@
         </w:tc>
         <w:tc>
           <w:tcPr>
-            <w:tcW w:type="dxa" w:w="2016"/>
+            <w:tcW w:type="dxa" w:w="1728"/>
           </w:tcPr>
           <w:p>
             <w:r>
@@ -515,7 +487,7 @@
       <w:tr>
         <w:tc>
           <w:tcPr>
-            <w:tcW w:type="dxa" w:w="1944"/>
+            <w:tcW w:type="dxa" w:w="1728"/>
           </w:tcPr>
           <w:p>
             <w:r>
@@ -525,7 +497,7 @@
         </w:tc>
         <w:tc>
           <w:tcPr>
-            <w:tcW w:type="dxa" w:w="1440"/>
+            <w:tcW w:type="dxa" w:w="1728"/>
           </w:tcPr>
           <w:p>
             <w:r>
@@ -535,7 +507,7 @@
         </w:tc>
         <w:tc>
           <w:tcPr>
-            <w:tcW w:type="dxa" w:w="2160"/>
+            <w:tcW w:type="dxa" w:w="1728"/>
           </w:tcPr>
           <w:p>
             <w:r>
@@ -545,7 +517,7 @@
         </w:tc>
         <w:tc>
           <w:tcPr>
-            <w:tcW w:type="dxa" w:w="2016"/>
+            <w:tcW w:type="dxa" w:w="1728"/>
           </w:tcPr>
           <w:p>
             <w:r>
@@ -555,7 +527,7 @@
         </w:tc>
         <w:tc>
           <w:tcPr>
-            <w:tcW w:type="dxa" w:w="2016"/>
+            <w:tcW w:type="dxa" w:w="1728"/>
           </w:tcPr>
           <w:p>
             <w:r>
@@ -567,7 +539,7 @@
       <w:tr>
         <w:tc>
           <w:tcPr>
-            <w:tcW w:type="dxa" w:w="1944"/>
+            <w:tcW w:type="dxa" w:w="1728"/>
           </w:tcPr>
           <w:p>
             <w:r>
@@ -577,7 +549,7 @@
         </w:tc>
         <w:tc>
           <w:tcPr>
-            <w:tcW w:type="dxa" w:w="1440"/>
+            <w:tcW w:type="dxa" w:w="1728"/>
           </w:tcPr>
           <w:p>
             <w:r>
@@ -587,7 +559,7 @@
         </w:tc>
         <w:tc>
           <w:tcPr>
-            <w:tcW w:type="dxa" w:w="2160"/>
+            <w:tcW w:type="dxa" w:w="1728"/>
           </w:tcPr>
           <w:p>
             <w:r>
@@ -597,7 +569,7 @@
         </w:tc>
         <w:tc>
           <w:tcPr>
-            <w:tcW w:type="dxa" w:w="2016"/>
+            <w:tcW w:type="dxa" w:w="1728"/>
           </w:tcPr>
           <w:p>
             <w:r>
@@ -607,7 +579,7 @@
         </w:tc>
         <w:tc>
           <w:tcPr>
-            <w:tcW w:type="dxa" w:w="2016"/>
+            <w:tcW w:type="dxa" w:w="1728"/>
           </w:tcPr>
           <w:p>
             <w:r>
@@ -619,7 +591,7 @@
       <w:tr>
         <w:tc>
           <w:tcPr>
-            <w:tcW w:type="dxa" w:w="1944"/>
+            <w:tcW w:type="dxa" w:w="1728"/>
           </w:tcPr>
           <w:p>
             <w:r>
@@ -629,7 +601,7 @@
         </w:tc>
         <w:tc>
           <w:tcPr>
-            <w:tcW w:type="dxa" w:w="1440"/>
+            <w:tcW w:type="dxa" w:w="1728"/>
           </w:tcPr>
           <w:p>
             <w:r>
@@ -639,7 +611,7 @@
         </w:tc>
         <w:tc>
           <w:tcPr>
-            <w:tcW w:type="dxa" w:w="2160"/>
+            <w:tcW w:type="dxa" w:w="1728"/>
           </w:tcPr>
           <w:p>
             <w:r>
@@ -649,7 +621,7 @@
         </w:tc>
         <w:tc>
           <w:tcPr>
-            <w:tcW w:type="dxa" w:w="2016"/>
+            <w:tcW w:type="dxa" w:w="1728"/>
           </w:tcPr>
           <w:p>
             <w:r>
@@ -659,7 +631,7 @@
         </w:tc>
         <w:tc>
           <w:tcPr>
-            <w:tcW w:type="dxa" w:w="2016"/>
+            <w:tcW w:type="dxa" w:w="1728"/>
           </w:tcPr>
           <w:p>
             <w:r>
@@ -671,7 +643,7 @@
       <w:tr>
         <w:tc>
           <w:tcPr>
-            <w:tcW w:type="dxa" w:w="1944"/>
+            <w:tcW w:type="dxa" w:w="1728"/>
           </w:tcPr>
           <w:p>
             <w:r>
@@ -681,7 +653,7 @@
         </w:tc>
         <w:tc>
           <w:tcPr>
-            <w:tcW w:type="dxa" w:w="1440"/>
+            <w:tcW w:type="dxa" w:w="1728"/>
           </w:tcPr>
           <w:p>
             <w:r>
@@ -691,7 +663,17 @@
         </w:tc>
         <w:tc>
           <w:tcPr>
-            <w:tcW w:type="dxa" w:w="2160"/>
+            <w:tcW w:type="dxa" w:w="1728"/>
+          </w:tcPr>
+          <w:p>
+            <w:r>
+              <w:t>Avengers: Infinity War</w:t>
+            </w:r>
+          </w:p>
+        </w:tc>
+        <w:tc>
+          <w:tcPr>
+            <w:tcW w:type="dxa" w:w="1728"/>
           </w:tcPr>
           <w:p>
             <w:r>
@@ -701,7 +683,101 @@
         </w:tc>
         <w:tc>
           <w:tcPr>
-            <w:tcW w:type="dxa" w:w="2016"/>
+            <w:tcW w:type="dxa" w:w="1728"/>
+          </w:tcPr>
+          <w:p>
+            <w:r>
+              <w:t>Harry Potter and the Deathly Hallows: Part 2</w:t>
+            </w:r>
+          </w:p>
+        </w:tc>
+      </w:tr>
+      <w:tr>
+        <w:tc>
+          <w:tcPr>
+            <w:tcW w:type="dxa" w:w="1728"/>
+          </w:tcPr>
+          <w:p>
+            <w:r>
+              <w:t>9. lowest rated</w:t>
+            </w:r>
+          </w:p>
+        </w:tc>
+        <w:tc>
+          <w:tcPr>
+            <w:tcW w:type="dxa" w:w="1728"/>
+          </w:tcPr>
+          <w:p>
+            <w:r>
+              <w:t>votes &gt;= 10</w:t>
+            </w:r>
+          </w:p>
+        </w:tc>
+        <w:tc>
+          <w:tcPr>
+            <w:tcW w:type="dxa" w:w="1728"/>
+          </w:tcPr>
+          <w:p>
+            <w:r>
+              <w:t>Jurassic World: Fallen Kingdom</w:t>
+            </w:r>
+          </w:p>
+        </w:tc>
+        <w:tc>
+          <w:tcPr>
+            <w:tcW w:type="dxa" w:w="1728"/>
+          </w:tcPr>
+          <w:p>
+            <w:r>
+              <w:t>Star Wars: The Last Jedi</w:t>
+            </w:r>
+          </w:p>
+        </w:tc>
+        <w:tc>
+          <w:tcPr>
+            <w:tcW w:type="dxa" w:w="1728"/>
+          </w:tcPr>
+          <w:p>
+            <w:r>
+              <w:t>Jurassic World</w:t>
+            </w:r>
+          </w:p>
+        </w:tc>
+      </w:tr>
+      <w:tr>
+        <w:tc>
+          <w:tcPr>
+            <w:tcW w:type="dxa" w:w="1728"/>
+          </w:tcPr>
+          <w:p>
+            <w:r>
+              <w:t>10. most popular</w:t>
+            </w:r>
+          </w:p>
+        </w:tc>
+        <w:tc>
+          <w:tcPr>
+            <w:tcW w:type="dxa" w:w="1728"/>
+          </w:tcPr>
+          <w:p>
+            <w:r>
+              <w:t>none</w:t>
+            </w:r>
+          </w:p>
+        </w:tc>
+        <w:tc>
+          <w:tcPr>
+            <w:tcW w:type="dxa" w:w="1728"/>
+          </w:tcPr>
+          <w:p>
+            <w:r>
+              <w:t>Avengers: Endgame</w:t>
+            </w:r>
+          </w:p>
+        </w:tc>
+        <w:tc>
+          <w:tcPr>
+            <w:tcW w:type="dxa" w:w="1728"/>
           </w:tcPr>
           <w:p>
             <w:r>
@@ -711,121 +787,16 @@
         </w:tc>
         <w:tc>
           <w:tcPr>
-            <w:tcW w:type="dxa" w:w="2016"/>
+            <w:tcW w:type="dxa" w:w="1728"/>
           </w:tcPr>
           <w:p>
             <w:r>
-              <w:t>Harry Potter and the Death</w:t>
-            </w:r>
-          </w:p>
-        </w:tc>
-      </w:tr>
-      <w:tr>
-        <w:tc>
-          <w:tcPr>
-            <w:tcW w:type="dxa" w:w="1944"/>
-          </w:tcPr>
-          <w:p>
-            <w:r>
-              <w:t>9. lowest rated</w:t>
-            </w:r>
-          </w:p>
-        </w:tc>
-        <w:tc>
-          <w:tcPr>
-            <w:tcW w:type="dxa" w:w="1440"/>
-          </w:tcPr>
-          <w:p>
-            <w:r>
-              <w:t>votes &gt;= 10</w:t>
-            </w:r>
-          </w:p>
-        </w:tc>
-        <w:tc>
-          <w:tcPr>
-            <w:tcW w:type="dxa" w:w="2160"/>
-          </w:tcPr>
-          <w:p>
-            <w:r>
-              <w:t>Jurassic World: Fallen Kin</w:t>
-            </w:r>
-          </w:p>
-        </w:tc>
-        <w:tc>
-          <w:tcPr>
-            <w:tcW w:type="dxa" w:w="2016"/>
-          </w:tcPr>
-          <w:p>
-            <w:r>
-              <w:t>Jurassic World</w:t>
-            </w:r>
-          </w:p>
-        </w:tc>
-        <w:tc>
-          <w:tcPr>
-            <w:tcW w:type="dxa" w:w="2016"/>
-          </w:tcPr>
-          <w:p>
-            <w:r>
-              <w:t>Star Wars: The Last Jedi</w:t>
-            </w:r>
-          </w:p>
-        </w:tc>
-      </w:tr>
-      <w:tr>
-        <w:tc>
-          <w:tcPr>
-            <w:tcW w:type="dxa" w:w="1944"/>
-          </w:tcPr>
-          <w:p>
-            <w:r>
-              <w:t>10. most popular</w:t>
-            </w:r>
-          </w:p>
-        </w:tc>
-        <w:tc>
-          <w:tcPr>
-            <w:tcW w:type="dxa" w:w="1440"/>
-          </w:tcPr>
-          <w:p>
-            <w:r>
-              <w:t>none</w:t>
-            </w:r>
-          </w:p>
-        </w:tc>
-        <w:tc>
-          <w:tcPr>
-            <w:tcW w:type="dxa" w:w="2160"/>
-          </w:tcPr>
-          <w:p>
-            <w:r>
-              <w:t>Avengers: Infinity War</w:t>
-            </w:r>
-          </w:p>
-        </w:tc>
-        <w:tc>
-          <w:tcPr>
-            <w:tcW w:type="dxa" w:w="2016"/>
-          </w:tcPr>
-          <w:p>
-            <w:r>
-              <w:t>Avengers: Endgame</w:t>
-            </w:r>
-          </w:p>
-        </w:tc>
-        <w:tc>
-          <w:tcPr>
-            <w:tcW w:type="dxa" w:w="2016"/>
-          </w:tcPr>
-          <w:p>
-            <w:r>
-              <w:t>Avengers: Age of Ultron</w:t>
+              <w:t>The Avengers</w:t>
             </w:r>
           </w:p>
         </w:tc>
       </w:tr>
     </w:tbl>
-    <w:p/>
     <w:p>
       <w:r>
         <w:t>Willis, science fiction and action: 0 matches.</w:t>
@@ -861,109 +832,81 @@
         <w:tblLook w:firstColumn="1" w:firstRow="1" w:lastColumn="0" w:lastRow="0" w:noHBand="0" w:noVBand="1" w:val="04A0"/>
       </w:tblPr>
       <w:tblGrid>
-        <w:gridCol w:w="1399"/>
-        <w:gridCol w:w="1399"/>
-        <w:gridCol w:w="1399"/>
-        <w:gridCol w:w="1399"/>
-        <w:gridCol w:w="1399"/>
-        <w:gridCol w:w="1399"/>
-        <w:gridCol w:w="1399"/>
+        <w:gridCol w:w="1234"/>
+        <w:gridCol w:w="1234"/>
+        <w:gridCol w:w="1234"/>
+        <w:gridCol w:w="1234"/>
+        <w:gridCol w:w="1234"/>
+        <w:gridCol w:w="1234"/>
+        <w:gridCol w:w="1234"/>
       </w:tblGrid>
       <w:tr>
         <w:tc>
           <w:tcPr>
-            <w:tcW w:type="dxa" w:w="1224"/>
+            <w:tcW w:type="dxa" w:w="1234"/>
           </w:tcPr>
           <w:p>
-            <w:r/>
             <w:r>
-              <w:rPr>
-                <w:b/>
-              </w:rPr>
               <w:t>group</w:t>
             </w:r>
           </w:p>
         </w:tc>
         <w:tc>
           <w:tcPr>
-            <w:tcW w:type="dxa" w:w="720"/>
+            <w:tcW w:type="dxa" w:w="1234"/>
           </w:tcPr>
           <w:p>
-            <w:r/>
             <w:r>
-              <w:rPr>
-                <w:b/>
-              </w:rPr>
               <w:t>films</w:t>
             </w:r>
           </w:p>
         </w:tc>
         <w:tc>
           <w:tcPr>
-            <w:tcW w:type="dxa" w:w="1440"/>
+            <w:tcW w:type="dxa" w:w="1234"/>
           </w:tcPr>
           <w:p>
-            <w:r/>
             <w:r>
-              <w:rPr>
-                <w:b/>
-              </w:rPr>
               <w:t>mean revenue</w:t>
             </w:r>
           </w:p>
         </w:tc>
         <w:tc>
           <w:tcPr>
-            <w:tcW w:type="dxa" w:w="1368"/>
+            <w:tcW w:type="dxa" w:w="1234"/>
           </w:tcPr>
           <w:p>
-            <w:r/>
             <w:r>
-              <w:rPr>
-                <w:b/>
-              </w:rPr>
               <w:t>mean budget</w:t>
             </w:r>
           </w:p>
         </w:tc>
         <w:tc>
           <w:tcPr>
-            <w:tcW w:type="dxa" w:w="1224"/>
+            <w:tcW w:type="dxa" w:w="1234"/>
           </w:tcPr>
           <w:p>
-            <w:r/>
             <w:r>
-              <w:rPr>
-                <w:b/>
-              </w:rPr>
               <w:t>median roi</w:t>
             </w:r>
           </w:p>
         </w:tc>
         <w:tc>
           <w:tcPr>
-            <w:tcW w:type="dxa" w:w="1440"/>
+            <w:tcW w:type="dxa" w:w="1234"/>
           </w:tcPr>
           <w:p>
-            <w:r/>
             <w:r>
-              <w:rPr>
-                <w:b/>
-              </w:rPr>
               <w:t>mean popularity</w:t>
             </w:r>
           </w:p>
         </w:tc>
         <w:tc>
           <w:tcPr>
-            <w:tcW w:type="dxa" w:w="1296"/>
+            <w:tcW w:type="dxa" w:w="1234"/>
           </w:tcPr>
           <w:p>
-            <w:r/>
             <w:r>
-              <w:rPr>
-                <w:b/>
-              </w:rPr>
               <w:t>mean rating</w:t>
             </w:r>
           </w:p>
@@ -972,7 +915,7 @@
       <w:tr>
         <w:tc>
           <w:tcPr>
-            <w:tcW w:type="dxa" w:w="1224"/>
+            <w:tcW w:type="dxa" w:w="1234"/>
           </w:tcPr>
           <w:p>
             <w:r>
@@ -982,7 +925,7 @@
         </w:tc>
         <w:tc>
           <w:tcPr>
-            <w:tcW w:type="dxa" w:w="720"/>
+            <w:tcW w:type="dxa" w:w="1234"/>
           </w:tcPr>
           <w:p>
             <w:r>
@@ -992,7 +935,7 @@
         </w:tc>
         <w:tc>
           <w:tcPr>
-            <w:tcW w:type="dxa" w:w="1440"/>
+            <w:tcW w:type="dxa" w:w="1234"/>
           </w:tcPr>
           <w:p>
             <w:r>
@@ -1002,7 +945,7 @@
         </w:tc>
         <w:tc>
           <w:tcPr>
-            <w:tcW w:type="dxa" w:w="1368"/>
+            <w:tcW w:type="dxa" w:w="1234"/>
           </w:tcPr>
           <w:p>
             <w:r>
@@ -1012,7 +955,7 @@
         </w:tc>
         <w:tc>
           <w:tcPr>
-            <w:tcW w:type="dxa" w:w="1224"/>
+            <w:tcW w:type="dxa" w:w="1234"/>
           </w:tcPr>
           <w:p>
             <w:r>
@@ -1022,21 +965,21 @@
         </w:tc>
         <w:tc>
           <w:tcPr>
-            <w:tcW w:type="dxa" w:w="1440"/>
+            <w:tcW w:type="dxa" w:w="1234"/>
           </w:tcPr>
           <w:p>
             <w:r>
-              <w:t>49.3</w:t>
+              <w:t>41.9</w:t>
             </w:r>
           </w:p>
         </w:tc>
         <w:tc>
           <w:tcPr>
-            <w:tcW w:type="dxa" w:w="1296"/>
+            <w:tcW w:type="dxa" w:w="1234"/>
           </w:tcPr>
           <w:p>
             <w:r>
-              <w:t>7.39</w:t>
+              <w:t>7.38</w:t>
             </w:r>
           </w:p>
         </w:tc>
@@ -1044,7 +987,7 @@
       <w:tr>
         <w:tc>
           <w:tcPr>
-            <w:tcW w:type="dxa" w:w="1224"/>
+            <w:tcW w:type="dxa" w:w="1234"/>
           </w:tcPr>
           <w:p>
             <w:r>
@@ -1054,7 +997,7 @@
         </w:tc>
         <w:tc>
           <w:tcPr>
-            <w:tcW w:type="dxa" w:w="720"/>
+            <w:tcW w:type="dxa" w:w="1234"/>
           </w:tcPr>
           <w:p>
             <w:r>
@@ -1064,7 +1007,7 @@
         </w:tc>
         <w:tc>
           <w:tcPr>
-            <w:tcW w:type="dxa" w:w="1440"/>
+            <w:tcW w:type="dxa" w:w="1234"/>
           </w:tcPr>
           <w:p>
             <w:r>
@@ -1074,7 +1017,7 @@
         </w:tc>
         <w:tc>
           <w:tcPr>
-            <w:tcW w:type="dxa" w:w="1368"/>
+            <w:tcW w:type="dxa" w:w="1234"/>
           </w:tcPr>
           <w:p>
             <w:r>
@@ -1084,7 +1027,7 @@
         </w:tc>
         <w:tc>
           <w:tcPr>
-            <w:tcW w:type="dxa" w:w="1224"/>
+            <w:tcW w:type="dxa" w:w="1234"/>
           </w:tcPr>
           <w:p>
             <w:r>
@@ -1094,21 +1037,21 @@
         </w:tc>
         <w:tc>
           <w:tcPr>
-            <w:tcW w:type="dxa" w:w="1440"/>
+            <w:tcW w:type="dxa" w:w="1234"/>
           </w:tcPr>
           <w:p>
             <w:r>
-              <w:t>40.9</w:t>
+              <w:t>42.3</w:t>
             </w:r>
           </w:p>
         </w:tc>
         <w:tc>
           <w:tcPr>
-            <w:tcW w:type="dxa" w:w="1296"/>
+            <w:tcW w:type="dxa" w:w="1234"/>
           </w:tcPr>
           <w:p>
             <w:r>
-              <w:t>7.44</w:t>
+              <w:t>7.45</w:t>
             </w:r>
           </w:p>
         </w:tc>
@@ -1134,79 +1077,59 @@
         <w:tblLook w:firstColumn="1" w:firstRow="1" w:lastColumn="0" w:lastRow="0" w:noHBand="0" w:noVBand="1" w:val="04A0"/>
       </w:tblPr>
       <w:tblGrid>
-        <w:gridCol w:w="1958"/>
-        <w:gridCol w:w="1958"/>
-        <w:gridCol w:w="1958"/>
-        <w:gridCol w:w="1958"/>
-        <w:gridCol w:w="1958"/>
+        <w:gridCol w:w="1728"/>
+        <w:gridCol w:w="1728"/>
+        <w:gridCol w:w="1728"/>
+        <w:gridCol w:w="1728"/>
+        <w:gridCol w:w="1728"/>
       </w:tblGrid>
       <w:tr>
         <w:tc>
           <w:tcPr>
-            <w:tcW w:type="dxa" w:w="3024"/>
+            <w:tcW w:type="dxa" w:w="1728"/>
           </w:tcPr>
           <w:p>
-            <w:r/>
             <w:r>
-              <w:rPr>
-                <w:b/>
-              </w:rPr>
               <w:t>franchise</w:t>
             </w:r>
           </w:p>
         </w:tc>
         <w:tc>
           <w:tcPr>
-            <w:tcW w:type="dxa" w:w="792"/>
+            <w:tcW w:type="dxa" w:w="1728"/>
           </w:tcPr>
           <w:p>
-            <w:r/>
             <w:r>
-              <w:rPr>
-                <w:b/>
-              </w:rPr>
               <w:t>films</w:t>
             </w:r>
           </w:p>
         </w:tc>
         <w:tc>
           <w:tcPr>
-            <w:tcW w:type="dxa" w:w="1656"/>
+            <w:tcW w:type="dxa" w:w="1728"/>
           </w:tcPr>
           <w:p>
-            <w:r/>
             <w:r>
-              <w:rPr>
-                <w:b/>
-              </w:rPr>
               <w:t>total revenue</w:t>
             </w:r>
           </w:p>
         </w:tc>
         <w:tc>
           <w:tcPr>
-            <w:tcW w:type="dxa" w:w="1512"/>
+            <w:tcW w:type="dxa" w:w="1728"/>
           </w:tcPr>
           <w:p>
-            <w:r/>
             <w:r>
-              <w:rPr>
-                <w:b/>
-              </w:rPr>
               <w:t>mean revenue</w:t>
             </w:r>
           </w:p>
         </w:tc>
         <w:tc>
           <w:tcPr>
-            <w:tcW w:type="dxa" w:w="1368"/>
+            <w:tcW w:type="dxa" w:w="1728"/>
           </w:tcPr>
           <w:p>
-            <w:r/>
             <w:r>
-              <w:rPr>
-                <w:b/>
-              </w:rPr>
               <w:t>mean rating</w:t>
             </w:r>
           </w:p>
@@ -1215,7 +1138,7 @@
       <w:tr>
         <w:tc>
           <w:tcPr>
-            <w:tcW w:type="dxa" w:w="3024"/>
+            <w:tcW w:type="dxa" w:w="1728"/>
           </w:tcPr>
           <w:p>
             <w:r>
@@ -1225,7 +1148,7 @@
         </w:tc>
         <w:tc>
           <w:tcPr>
-            <w:tcW w:type="dxa" w:w="792"/>
+            <w:tcW w:type="dxa" w:w="1728"/>
           </w:tcPr>
           <w:p>
             <w:r>
@@ -1235,7 +1158,7 @@
         </w:tc>
         <w:tc>
           <w:tcPr>
-            <w:tcW w:type="dxa" w:w="1656"/>
+            <w:tcW w:type="dxa" w:w="1728"/>
           </w:tcPr>
           <w:p>
             <w:r>
@@ -1245,7 +1168,7 @@
         </w:tc>
         <w:tc>
           <w:tcPr>
-            <w:tcW w:type="dxa" w:w="1512"/>
+            <w:tcW w:type="dxa" w:w="1728"/>
           </w:tcPr>
           <w:p>
             <w:r>
@@ -1255,7 +1178,7 @@
         </w:tc>
         <w:tc>
           <w:tcPr>
-            <w:tcW w:type="dxa" w:w="1368"/>
+            <w:tcW w:type="dxa" w:w="1728"/>
           </w:tcPr>
           <w:p>
             <w:r>
@@ -1267,7 +1190,7 @@
       <w:tr>
         <w:tc>
           <w:tcPr>
-            <w:tcW w:type="dxa" w:w="3024"/>
+            <w:tcW w:type="dxa" w:w="1728"/>
           </w:tcPr>
           <w:p>
             <w:r>
@@ -1277,7 +1200,7 @@
         </w:tc>
         <w:tc>
           <w:tcPr>
-            <w:tcW w:type="dxa" w:w="792"/>
+            <w:tcW w:type="dxa" w:w="1728"/>
           </w:tcPr>
           <w:p>
             <w:r>
@@ -1287,7 +1210,7 @@
         </w:tc>
         <w:tc>
           <w:tcPr>
-            <w:tcW w:type="dxa" w:w="1656"/>
+            <w:tcW w:type="dxa" w:w="1728"/>
           </w:tcPr>
           <w:p>
             <w:r>
@@ -1297,7 +1220,7 @@
         </w:tc>
         <w:tc>
           <w:tcPr>
-            <w:tcW w:type="dxa" w:w="1512"/>
+            <w:tcW w:type="dxa" w:w="1728"/>
           </w:tcPr>
           <w:p>
             <w:r>
@@ -1307,11 +1230,11 @@
         </w:tc>
         <w:tc>
           <w:tcPr>
-            <w:tcW w:type="dxa" w:w="1368"/>
+            <w:tcW w:type="dxa" w:w="1728"/>
           </w:tcPr>
           <w:p>
             <w:r>
-              <w:t>6.99</w:t>
+              <w:t>6.95</w:t>
             </w:r>
           </w:p>
         </w:tc>
@@ -1319,7 +1242,7 @@
       <w:tr>
         <w:tc>
           <w:tcPr>
-            <w:tcW w:type="dxa" w:w="3024"/>
+            <w:tcW w:type="dxa" w:w="1728"/>
           </w:tcPr>
           <w:p>
             <w:r>
@@ -1329,7 +1252,7 @@
         </w:tc>
         <w:tc>
           <w:tcPr>
-            <w:tcW w:type="dxa" w:w="792"/>
+            <w:tcW w:type="dxa" w:w="1728"/>
           </w:tcPr>
           <w:p>
             <w:r>
@@ -1339,7 +1262,7 @@
         </w:tc>
         <w:tc>
           <w:tcPr>
-            <w:tcW w:type="dxa" w:w="1656"/>
+            <w:tcW w:type="dxa" w:w="1728"/>
           </w:tcPr>
           <w:p>
             <w:r>
@@ -1349,7 +1272,7 @@
         </w:tc>
         <w:tc>
           <w:tcPr>
-            <w:tcW w:type="dxa" w:w="1512"/>
+            <w:tcW w:type="dxa" w:w="1728"/>
           </w:tcPr>
           <w:p>
             <w:r>
@@ -1359,11 +1282,11 @@
         </w:tc>
         <w:tc>
           <w:tcPr>
-            <w:tcW w:type="dxa" w:w="1368"/>
+            <w:tcW w:type="dxa" w:w="1728"/>
           </w:tcPr>
           <w:p>
             <w:r>
-              <w:t>6.61</w:t>
+              <w:t>6.60</w:t>
             </w:r>
           </w:p>
         </w:tc>
@@ -1371,7 +1294,7 @@
       <w:tr>
         <w:tc>
           <w:tcPr>
-            <w:tcW w:type="dxa" w:w="3024"/>
+            <w:tcW w:type="dxa" w:w="1728"/>
           </w:tcPr>
           <w:p>
             <w:r>
@@ -1381,7 +1304,7 @@
         </w:tc>
         <w:tc>
           <w:tcPr>
-            <w:tcW w:type="dxa" w:w="792"/>
+            <w:tcW w:type="dxa" w:w="1728"/>
           </w:tcPr>
           <w:p>
             <w:r>
@@ -1391,7 +1314,7 @@
         </w:tc>
         <w:tc>
           <w:tcPr>
-            <w:tcW w:type="dxa" w:w="1656"/>
+            <w:tcW w:type="dxa" w:w="1728"/>
           </w:tcPr>
           <w:p>
             <w:r>
@@ -1401,7 +1324,7 @@
         </w:tc>
         <w:tc>
           <w:tcPr>
-            <w:tcW w:type="dxa" w:w="1512"/>
+            <w:tcW w:type="dxa" w:w="1728"/>
           </w:tcPr>
           <w:p>
             <w:r>
@@ -1411,11 +1334,11 @@
         </w:tc>
         <w:tc>
           <w:tcPr>
-            <w:tcW w:type="dxa" w:w="1368"/>
+            <w:tcW w:type="dxa" w:w="1728"/>
           </w:tcPr>
           <w:p>
             <w:r>
-              <w:t>7.61</w:t>
+              <w:t>7.60</w:t>
             </w:r>
           </w:p>
         </w:tc>
@@ -1423,7 +1346,7 @@
       <w:tr>
         <w:tc>
           <w:tcPr>
-            <w:tcW w:type="dxa" w:w="3024"/>
+            <w:tcW w:type="dxa" w:w="1728"/>
           </w:tcPr>
           <w:p>
             <w:r>
@@ -1433,7 +1356,7 @@
         </w:tc>
         <w:tc>
           <w:tcPr>
-            <w:tcW w:type="dxa" w:w="792"/>
+            <w:tcW w:type="dxa" w:w="1728"/>
           </w:tcPr>
           <w:p>
             <w:r>
@@ -1443,7 +1366,7 @@
         </w:tc>
         <w:tc>
           <w:tcPr>
-            <w:tcW w:type="dxa" w:w="1656"/>
+            <w:tcW w:type="dxa" w:w="1728"/>
           </w:tcPr>
           <w:p>
             <w:r>
@@ -1453,7 +1376,7 @@
         </w:tc>
         <w:tc>
           <w:tcPr>
-            <w:tcW w:type="dxa" w:w="1512"/>
+            <w:tcW w:type="dxa" w:w="1728"/>
           </w:tcPr>
           <w:p>
             <w:r>
@@ -1463,11 +1386,11 @@
         </w:tc>
         <w:tc>
           <w:tcPr>
-            <w:tcW w:type="dxa" w:w="1368"/>
+            <w:tcW w:type="dxa" w:w="1728"/>
           </w:tcPr>
           <w:p>
             <w:r>
-              <w:t>7.22</w:t>
+              <w:t>7.20</w:t>
             </w:r>
           </w:p>
         </w:tc>
@@ -1488,64 +1411,48 @@
         <w:tblLook w:firstColumn="1" w:firstRow="1" w:lastColumn="0" w:lastRow="0" w:noHBand="0" w:noVBand="1" w:val="04A0"/>
       </w:tblPr>
       <w:tblGrid>
-        <w:gridCol w:w="2448"/>
-        <w:gridCol w:w="2448"/>
-        <w:gridCol w:w="2448"/>
-        <w:gridCol w:w="2448"/>
+        <w:gridCol w:w="2160"/>
+        <w:gridCol w:w="2160"/>
+        <w:gridCol w:w="2160"/>
+        <w:gridCol w:w="2160"/>
       </w:tblGrid>
       <w:tr>
         <w:tc>
           <w:tcPr>
-            <w:tcW w:type="dxa" w:w="3024"/>
+            <w:tcW w:type="dxa" w:w="2160"/>
           </w:tcPr>
           <w:p>
-            <w:r/>
             <w:r>
-              <w:rPr>
-                <w:b/>
-              </w:rPr>
               <w:t>director</w:t>
             </w:r>
           </w:p>
         </w:tc>
         <w:tc>
           <w:tcPr>
-            <w:tcW w:type="dxa" w:w="864"/>
+            <w:tcW w:type="dxa" w:w="2160"/>
           </w:tcPr>
           <w:p>
-            <w:r/>
             <w:r>
-              <w:rPr>
-                <w:b/>
-              </w:rPr>
               <w:t>films</w:t>
             </w:r>
           </w:p>
         </w:tc>
         <w:tc>
           <w:tcPr>
-            <w:tcW w:type="dxa" w:w="1872"/>
+            <w:tcW w:type="dxa" w:w="2160"/>
           </w:tcPr>
           <w:p>
-            <w:r/>
             <w:r>
-              <w:rPr>
-                <w:b/>
-              </w:rPr>
               <w:t>total revenue</w:t>
             </w:r>
           </w:p>
         </w:tc>
         <w:tc>
           <w:tcPr>
-            <w:tcW w:type="dxa" w:w="1440"/>
+            <w:tcW w:type="dxa" w:w="2160"/>
           </w:tcPr>
           <w:p>
-            <w:r/>
             <w:r>
-              <w:rPr>
-                <w:b/>
-              </w:rPr>
               <w:t>mean rating</w:t>
             </w:r>
           </w:p>
@@ -1554,7 +1461,7 @@
       <w:tr>
         <w:tc>
           <w:tcPr>
-            <w:tcW w:type="dxa" w:w="3024"/>
+            <w:tcW w:type="dxa" w:w="2160"/>
           </w:tcPr>
           <w:p>
             <w:r>
@@ -1564,7 +1471,7 @@
         </w:tc>
         <w:tc>
           <w:tcPr>
-            <w:tcW w:type="dxa" w:w="864"/>
+            <w:tcW w:type="dxa" w:w="2160"/>
           </w:tcPr>
           <w:p>
             <w:r>
@@ -1574,7 +1481,7 @@
         </w:tc>
         <w:tc>
           <w:tcPr>
-            <w:tcW w:type="dxa" w:w="1872"/>
+            <w:tcW w:type="dxa" w:w="2160"/>
           </w:tcPr>
           <w:p>
             <w:r>
@@ -1584,11 +1491,11 @@
         </w:tc>
         <w:tc>
           <w:tcPr>
-            <w:tcW w:type="dxa" w:w="1440"/>
+            <w:tcW w:type="dxa" w:w="2160"/>
           </w:tcPr>
           <w:p>
             <w:r>
-              <w:t>7.76</w:t>
+              <w:t>7.75</w:t>
             </w:r>
           </w:p>
         </w:tc>
@@ -1596,7 +1503,133 @@
       <w:tr>
         <w:tc>
           <w:tcPr>
-            <w:tcW w:type="dxa" w:w="3024"/>
+            <w:tcW w:type="dxa" w:w="2160"/>
+          </w:tcPr>
+          <w:p>
+            <w:r>
+              <w:t>Anthony Russo</w:t>
+            </w:r>
+          </w:p>
+        </w:tc>
+        <w:tc>
+          <w:tcPr>
+            <w:tcW w:type="dxa" w:w="2160"/>
+          </w:tcPr>
+          <w:p>
+            <w:r>
+              <w:t>1</w:t>
+            </w:r>
+          </w:p>
+        </w:tc>
+        <w:tc>
+          <w:tcPr>
+            <w:tcW w:type="dxa" w:w="2160"/>
+          </w:tcPr>
+          <w:p>
+            <w:r>
+              <w:t>2,927.4</w:t>
+            </w:r>
+          </w:p>
+        </w:tc>
+        <w:tc>
+          <w:tcPr>
+            <w:tcW w:type="dxa" w:w="2160"/>
+          </w:tcPr>
+          <w:p>
+            <w:r>
+              <w:t>8.20</w:t>
+            </w:r>
+          </w:p>
+        </w:tc>
+      </w:tr>
+      <w:tr>
+        <w:tc>
+          <w:tcPr>
+            <w:tcW w:type="dxa" w:w="2160"/>
+          </w:tcPr>
+          <w:p>
+            <w:r>
+              <w:t>Joss Whedon</w:t>
+            </w:r>
+          </w:p>
+        </w:tc>
+        <w:tc>
+          <w:tcPr>
+            <w:tcW w:type="dxa" w:w="2160"/>
+          </w:tcPr>
+          <w:p>
+            <w:r>
+              <w:t>2</w:t>
+            </w:r>
+          </w:p>
+        </w:tc>
+        <w:tc>
+          <w:tcPr>
+            <w:tcW w:type="dxa" w:w="2160"/>
+          </w:tcPr>
+          <w:p>
+            <w:r>
+              <w:t>2,924.2</w:t>
+            </w:r>
+          </w:p>
+        </w:tc>
+        <w:tc>
+          <w:tcPr>
+            <w:tcW w:type="dxa" w:w="2160"/>
+          </w:tcPr>
+          <w:p>
+            <w:r>
+              <w:t>7.69</w:t>
+            </w:r>
+          </w:p>
+        </w:tc>
+      </w:tr>
+      <w:tr>
+        <w:tc>
+          <w:tcPr>
+            <w:tcW w:type="dxa" w:w="2160"/>
+          </w:tcPr>
+          <w:p>
+            <w:r>
+              <w:t>J.J. Abrams</w:t>
+            </w:r>
+          </w:p>
+        </w:tc>
+        <w:tc>
+          <w:tcPr>
+            <w:tcW w:type="dxa" w:w="2160"/>
+          </w:tcPr>
+          <w:p>
+            <w:r>
+              <w:t>1</w:t>
+            </w:r>
+          </w:p>
+        </w:tc>
+        <w:tc>
+          <w:tcPr>
+            <w:tcW w:type="dxa" w:w="2160"/>
+          </w:tcPr>
+          <w:p>
+            <w:r>
+              <w:t>2,068.2</w:t>
+            </w:r>
+          </w:p>
+        </w:tc>
+        <w:tc>
+          <w:tcPr>
+            <w:tcW w:type="dxa" w:w="2160"/>
+          </w:tcPr>
+          <w:p>
+            <w:r>
+              <w:t>7.20</w:t>
+            </w:r>
+          </w:p>
+        </w:tc>
+      </w:tr>
+      <w:tr>
+        <w:tc>
+          <w:tcPr>
+            <w:tcW w:type="dxa" w:w="2160"/>
           </w:tcPr>
           <w:p>
             <w:r>
@@ -1606,133 +1639,7 @@
         </w:tc>
         <w:tc>
           <w:tcPr>
-            <w:tcW w:type="dxa" w:w="864"/>
-          </w:tcPr>
-          <w:p>
-            <w:r>
-              <w:t>2</w:t>
-            </w:r>
-          </w:p>
-        </w:tc>
-        <w:tc>
-          <w:tcPr>
-            <w:tcW w:type="dxa" w:w="1872"/>
-          </w:tcPr>
-          <w:p>
-            <w:r>
-              <w:t>4,979.9</w:t>
-            </w:r>
-          </w:p>
-        </w:tc>
-        <w:tc>
-          <w:tcPr>
-            <w:tcW w:type="dxa" w:w="1440"/>
-          </w:tcPr>
-          <w:p>
-            <w:r>
-              <w:t>8.25</w:t>
-            </w:r>
-          </w:p>
-        </w:tc>
-      </w:tr>
-      <w:tr>
-        <w:tc>
-          <w:tcPr>
-            <w:tcW w:type="dxa" w:w="3024"/>
-          </w:tcPr>
-          <w:p>
-            <w:r>
-              <w:t>Joss Whedon</w:t>
-            </w:r>
-          </w:p>
-        </w:tc>
-        <w:tc>
-          <w:tcPr>
-            <w:tcW w:type="dxa" w:w="864"/>
-          </w:tcPr>
-          <w:p>
-            <w:r>
-              <w:t>2</w:t>
-            </w:r>
-          </w:p>
-        </w:tc>
-        <w:tc>
-          <w:tcPr>
-            <w:tcW w:type="dxa" w:w="1872"/>
-          </w:tcPr>
-          <w:p>
-            <w:r>
-              <w:t>2,924.2</w:t>
-            </w:r>
-          </w:p>
-        </w:tc>
-        <w:tc>
-          <w:tcPr>
-            <w:tcW w:type="dxa" w:w="1440"/>
-          </w:tcPr>
-          <w:p>
-            <w:r>
-              <w:t>7.68</w:t>
-            </w:r>
-          </w:p>
-        </w:tc>
-      </w:tr>
-      <w:tr>
-        <w:tc>
-          <w:tcPr>
-            <w:tcW w:type="dxa" w:w="3024"/>
-          </w:tcPr>
-          <w:p>
-            <w:r>
-              <w:t>Jennifer Lee</w:t>
-            </w:r>
-          </w:p>
-        </w:tc>
-        <w:tc>
-          <w:tcPr>
-            <w:tcW w:type="dxa" w:w="864"/>
-          </w:tcPr>
-          <w:p>
-            <w:r>
-              <w:t>2</w:t>
-            </w:r>
-          </w:p>
-        </w:tc>
-        <w:tc>
-          <w:tcPr>
-            <w:tcW w:type="dxa" w:w="1872"/>
-          </w:tcPr>
-          <w:p>
-            <w:r>
-              <w:t>2,727.9</w:t>
-            </w:r>
-          </w:p>
-        </w:tc>
-        <w:tc>
-          <w:tcPr>
-            <w:tcW w:type="dxa" w:w="1440"/>
-          </w:tcPr>
-          <w:p>
-            <w:r>
-              <w:t>7.22</w:t>
-            </w:r>
-          </w:p>
-        </w:tc>
-      </w:tr>
-      <w:tr>
-        <w:tc>
-          <w:tcPr>
-            <w:tcW w:type="dxa" w:w="3024"/>
-          </w:tcPr>
-          <w:p>
-            <w:r>
-              <w:t>J.J. Abrams</w:t>
-            </w:r>
-          </w:p>
-        </w:tc>
-        <w:tc>
-          <w:tcPr>
-            <w:tcW w:type="dxa" w:w="864"/>
+            <w:tcW w:type="dxa" w:w="2160"/>
           </w:tcPr>
           <w:p>
             <w:r>
@@ -1742,21 +1649,21 @@
         </w:tc>
         <w:tc>
           <w:tcPr>
-            <w:tcW w:type="dxa" w:w="1872"/>
+            <w:tcW w:type="dxa" w:w="2160"/>
           </w:tcPr>
           <w:p>
             <w:r>
-              <w:t>2,068.2</w:t>
+              <w:t>2,052.4</w:t>
             </w:r>
           </w:p>
         </w:tc>
         <w:tc>
           <w:tcPr>
-            <w:tcW w:type="dxa" w:w="1440"/>
+            <w:tcW w:type="dxa" w:w="2160"/>
           </w:tcPr>
           <w:p>
             <w:r>
-              <w:t>7.24</w:t>
+              <w:t>8.24</w:t>
             </w:r>
           </w:p>
         </w:tc>
@@ -1767,13 +1674,628 @@
         <w:pStyle w:val="Heading1"/>
       </w:pPr>
       <w:r>
-        <w:t>7. Visualizations</w:t>
+        <w:t>7. Distributions and outliers</w:t>
+      </w:r>
+    </w:p>
+    <w:p>
+      <w:r>
+        <w:t>Before trusting any ranking, look at the spread of the columns the rankings rest on. The table is describe() on the six numeric columns; the histograms show the shape of the columns that are skewed and the boxplot shows which points are genuinely unusual.</w:t>
+      </w:r>
+    </w:p>
+    <w:tbl>
+      <w:tblPr>
+        <w:tblStyle w:val="LightGrid-Accent1"/>
+        <w:tblW w:type="auto" w:w="0"/>
+        <w:tblLook w:firstColumn="1" w:firstRow="1" w:lastColumn="0" w:lastRow="0" w:noHBand="0" w:noVBand="1" w:val="04A0"/>
+      </w:tblPr>
+      <w:tblGrid>
+        <w:gridCol w:w="1440"/>
+        <w:gridCol w:w="1440"/>
+        <w:gridCol w:w="1440"/>
+        <w:gridCol w:w="1440"/>
+        <w:gridCol w:w="1440"/>
+        <w:gridCol w:w="1440"/>
+      </w:tblGrid>
+      <w:tr>
+        <w:tc>
+          <w:tcPr>
+            <w:tcW w:type="dxa" w:w="1440"/>
+          </w:tcPr>
+          <w:p>
+            <w:r>
+              <w:t>stat</w:t>
+            </w:r>
+          </w:p>
+        </w:tc>
+        <w:tc>
+          <w:tcPr>
+            <w:tcW w:type="dxa" w:w="1440"/>
+          </w:tcPr>
+          <w:p>
+            <w:r>
+              <w:t>budget_musd</w:t>
+            </w:r>
+          </w:p>
+        </w:tc>
+        <w:tc>
+          <w:tcPr>
+            <w:tcW w:type="dxa" w:w="1440"/>
+          </w:tcPr>
+          <w:p>
+            <w:r>
+              <w:t>revenue_musd</w:t>
+            </w:r>
+          </w:p>
+        </w:tc>
+        <w:tc>
+          <w:tcPr>
+            <w:tcW w:type="dxa" w:w="1440"/>
+          </w:tcPr>
+          <w:p>
+            <w:r>
+              <w:t>runtime</w:t>
+            </w:r>
+          </w:p>
+        </w:tc>
+        <w:tc>
+          <w:tcPr>
+            <w:tcW w:type="dxa" w:w="1440"/>
+          </w:tcPr>
+          <w:p>
+            <w:r>
+              <w:t>vote_average</w:t>
+            </w:r>
+          </w:p>
+        </w:tc>
+        <w:tc>
+          <w:tcPr>
+            <w:tcW w:type="dxa" w:w="1440"/>
+          </w:tcPr>
+          <w:p>
+            <w:r>
+              <w:t>popularity</w:t>
+            </w:r>
+          </w:p>
+        </w:tc>
+      </w:tr>
+      <w:tr>
+        <w:tc>
+          <w:tcPr>
+            <w:tcW w:type="dxa" w:w="1440"/>
+          </w:tcPr>
+          <w:p>
+            <w:r>
+              <w:t>count</w:t>
+            </w:r>
+          </w:p>
+        </w:tc>
+        <w:tc>
+          <w:tcPr>
+            <w:tcW w:type="dxa" w:w="1440"/>
+          </w:tcPr>
+          <w:p>
+            <w:r>
+              <w:t>18</w:t>
+            </w:r>
+          </w:p>
+        </w:tc>
+        <w:tc>
+          <w:tcPr>
+            <w:tcW w:type="dxa" w:w="1440"/>
+          </w:tcPr>
+          <w:p>
+            <w:r>
+              <w:t>18</w:t>
+            </w:r>
+          </w:p>
+        </w:tc>
+        <w:tc>
+          <w:tcPr>
+            <w:tcW w:type="dxa" w:w="1440"/>
+          </w:tcPr>
+          <w:p>
+            <w:r>
+              <w:t>18</w:t>
+            </w:r>
+          </w:p>
+        </w:tc>
+        <w:tc>
+          <w:tcPr>
+            <w:tcW w:type="dxa" w:w="1440"/>
+          </w:tcPr>
+          <w:p>
+            <w:r>
+              <w:t>18</w:t>
+            </w:r>
+          </w:p>
+        </w:tc>
+        <w:tc>
+          <w:tcPr>
+            <w:tcW w:type="dxa" w:w="1440"/>
+          </w:tcPr>
+          <w:p>
+            <w:r>
+              <w:t>18</w:t>
+            </w:r>
+          </w:p>
+        </w:tc>
+      </w:tr>
+      <w:tr>
+        <w:tc>
+          <w:tcPr>
+            <w:tcW w:type="dxa" w:w="1440"/>
+          </w:tcPr>
+          <w:p>
+            <w:r>
+              <w:t>mean</w:t>
+            </w:r>
+          </w:p>
+        </w:tc>
+        <w:tc>
+          <w:tcPr>
+            <w:tcW w:type="dxa" w:w="1440"/>
+          </w:tcPr>
+          <w:p>
+            <w:r>
+              <w:t>213.78</w:t>
+            </w:r>
+          </w:p>
+        </w:tc>
+        <w:tc>
+          <w:tcPr>
+            <w:tcW w:type="dxa" w:w="1440"/>
+          </w:tcPr>
+          <w:p>
+            <w:r>
+              <w:t>1,699.04</w:t>
+            </w:r>
+          </w:p>
+        </w:tc>
+        <w:tc>
+          <w:tcPr>
+            <w:tcW w:type="dxa" w:w="1440"/>
+          </w:tcPr>
+          <w:p>
+            <w:r>
+              <w:t>138.00</w:t>
+            </w:r>
+          </w:p>
+        </w:tc>
+        <w:tc>
+          <w:tcPr>
+            <w:tcW w:type="dxa" w:w="1440"/>
+          </w:tcPr>
+          <w:p>
+            <w:r>
+              <w:t>7.39</w:t>
+            </w:r>
+          </w:p>
+        </w:tc>
+        <w:tc>
+          <w:tcPr>
+            <w:tcW w:type="dxa" w:w="1440"/>
+          </w:tcPr>
+          <w:p>
+            <w:r>
+              <w:t>41.95</w:t>
+            </w:r>
+          </w:p>
+        </w:tc>
+      </w:tr>
+      <w:tr>
+        <w:tc>
+          <w:tcPr>
+            <w:tcW w:type="dxa" w:w="1440"/>
+          </w:tcPr>
+          <w:p>
+            <w:r>
+              <w:t>std</w:t>
+            </w:r>
+          </w:p>
+        </w:tc>
+        <w:tc>
+          <w:tcPr>
+            <w:tcW w:type="dxa" w:w="1440"/>
+          </w:tcPr>
+          <w:p>
+            <w:r>
+              <w:t>61.96</w:t>
+            </w:r>
+          </w:p>
+        </w:tc>
+        <w:tc>
+          <w:tcPr>
+            <w:tcW w:type="dxa" w:w="1440"/>
+          </w:tcPr>
+          <w:p>
+            <w:r>
+              <w:t>537.61</w:t>
+            </w:r>
+          </w:p>
+        </w:tc>
+        <w:tc>
+          <w:tcPr>
+            <w:tcW w:type="dxa" w:w="1440"/>
+          </w:tcPr>
+          <w:p>
+            <w:r>
+              <w:t>23.85</w:t>
+            </w:r>
+          </w:p>
+        </w:tc>
+        <w:tc>
+          <w:tcPr>
+            <w:tcW w:type="dxa" w:w="1440"/>
+          </w:tcPr>
+          <w:p>
+            <w:r>
+              <w:t>0.53</w:t>
+            </w:r>
+          </w:p>
+        </w:tc>
+        <w:tc>
+          <w:tcPr>
+            <w:tcW w:type="dxa" w:w="1440"/>
+          </w:tcPr>
+          <w:p>
+            <w:r>
+              <w:t>22.21</w:t>
+            </w:r>
+          </w:p>
+        </w:tc>
+      </w:tr>
+      <w:tr>
+        <w:tc>
+          <w:tcPr>
+            <w:tcW w:type="dxa" w:w="1440"/>
+          </w:tcPr>
+          <w:p>
+            <w:r>
+              <w:t>min</w:t>
+            </w:r>
+          </w:p>
+        </w:tc>
+        <w:tc>
+          <w:tcPr>
+            <w:tcW w:type="dxa" w:w="1440"/>
+          </w:tcPr>
+          <w:p>
+            <w:r>
+              <w:t>125.00</w:t>
+            </w:r>
+          </w:p>
+        </w:tc>
+        <w:tc>
+          <w:tcPr>
+            <w:tcW w:type="dxa" w:w="1440"/>
+          </w:tcPr>
+          <w:p>
+            <w:r>
+              <w:t>1,243.23</w:t>
+            </w:r>
+          </w:p>
+        </w:tc>
+        <w:tc>
+          <w:tcPr>
+            <w:tcW w:type="dxa" w:w="1440"/>
+          </w:tcPr>
+          <w:p>
+            <w:r>
+              <w:t>102.00</w:t>
+            </w:r>
+          </w:p>
+        </w:tc>
+        <w:tc>
+          <w:tcPr>
+            <w:tcW w:type="dxa" w:w="1440"/>
+          </w:tcPr>
+          <w:p>
+            <w:r>
+              <w:t>6.50</w:t>
+            </w:r>
+          </w:p>
+        </w:tc>
+        <w:tc>
+          <w:tcPr>
+            <w:tcW w:type="dxa" w:w="1440"/>
+          </w:tcPr>
+          <w:p>
+            <w:r>
+              <w:t>18.11</w:t>
+            </w:r>
+          </w:p>
+        </w:tc>
+      </w:tr>
+      <w:tr>
+        <w:tc>
+          <w:tcPr>
+            <w:tcW w:type="dxa" w:w="1440"/>
+          </w:tcPr>
+          <w:p>
+            <w:r>
+              <w:t>25%</w:t>
+            </w:r>
+          </w:p>
+        </w:tc>
+        <w:tc>
+          <w:tcPr>
+            <w:tcW w:type="dxa" w:w="1440"/>
+          </w:tcPr>
+          <w:p>
+            <w:r>
+              <w:t>162.50</w:t>
+            </w:r>
+          </w:p>
+        </w:tc>
+        <w:tc>
+          <w:tcPr>
+            <w:tcW w:type="dxa" w:w="1440"/>
+          </w:tcPr>
+          <w:p>
+            <w:r>
+              <w:t>1,336.18</w:t>
+            </w:r>
+          </w:p>
+        </w:tc>
+        <w:tc>
+          <w:tcPr>
+            <w:tcW w:type="dxa" w:w="1440"/>
+          </w:tcPr>
+          <w:p>
+            <w:r>
+              <w:t>125.25</w:t>
+            </w:r>
+          </w:p>
+        </w:tc>
+        <w:tc>
+          <w:tcPr>
+            <w:tcW w:type="dxa" w:w="1440"/>
+          </w:tcPr>
+          <w:p>
+            <w:r>
+              <w:t>7.12</w:t>
+            </w:r>
+          </w:p>
+        </w:tc>
+        <w:tc>
+          <w:tcPr>
+            <w:tcW w:type="dxa" w:w="1440"/>
+          </w:tcPr>
+          <w:p>
+            <w:r>
+              <w:t>28.00</w:t>
+            </w:r>
+          </w:p>
+        </w:tc>
+      </w:tr>
+      <w:tr>
+        <w:tc>
+          <w:tcPr>
+            <w:tcW w:type="dxa" w:w="1440"/>
+          </w:tcPr>
+          <w:p>
+            <w:r>
+              <w:t>50%</w:t>
+            </w:r>
+          </w:p>
+        </w:tc>
+        <w:tc>
+          <w:tcPr>
+            <w:tcW w:type="dxa" w:w="1440"/>
+          </w:tcPr>
+          <w:p>
+            <w:r>
+              <w:t>200.00</w:t>
+            </w:r>
+          </w:p>
+        </w:tc>
+        <w:tc>
+          <w:tcPr>
+            <w:tcW w:type="dxa" w:w="1440"/>
+          </w:tcPr>
+          <w:p>
+            <w:r>
+              <w:t>1,484.54</w:t>
+            </w:r>
+          </w:p>
+        </w:tc>
+        <w:tc>
+          <w:tcPr>
+            <w:tcW w:type="dxa" w:w="1440"/>
+          </w:tcPr>
+          <w:p>
+            <w:r>
+              <w:t>135.50</w:t>
+            </w:r>
+          </w:p>
+        </w:tc>
+        <w:tc>
+          <w:tcPr>
+            <w:tcW w:type="dxa" w:w="1440"/>
+          </w:tcPr>
+          <w:p>
+            <w:r>
+              <w:t>7.25</w:t>
+            </w:r>
+          </w:p>
+        </w:tc>
+        <w:tc>
+          <w:tcPr>
+            <w:tcW w:type="dxa" w:w="1440"/>
+          </w:tcPr>
+          <w:p>
+            <w:r>
+              <w:t>33.61</w:t>
+            </w:r>
+          </w:p>
+        </w:tc>
+      </w:tr>
+      <w:tr>
+        <w:tc>
+          <w:tcPr>
+            <w:tcW w:type="dxa" w:w="1440"/>
+          </w:tcPr>
+          <w:p>
+            <w:r>
+              <w:t>75%</w:t>
+            </w:r>
+          </w:p>
+        </w:tc>
+        <w:tc>
+          <w:tcPr>
+            <w:tcW w:type="dxa" w:w="1440"/>
+          </w:tcPr>
+          <w:p>
+            <w:r>
+              <w:t>243.00</w:t>
+            </w:r>
+          </w:p>
+        </w:tc>
+        <w:tc>
+          <w:tcPr>
+            <w:tcW w:type="dxa" w:w="1440"/>
+          </w:tcPr>
+          <w:p>
+            <w:r>
+              <w:t>1,957.20</w:t>
+            </w:r>
+          </w:p>
+        </w:tc>
+        <w:tc>
+          <w:tcPr>
+            <w:tcW w:type="dxa" w:w="1440"/>
+          </w:tcPr>
+          <w:p>
+            <w:r>
+              <w:t>147.50</w:t>
+            </w:r>
+          </w:p>
+        </w:tc>
+        <w:tc>
+          <w:tcPr>
+            <w:tcW w:type="dxa" w:w="1440"/>
+          </w:tcPr>
+          <w:p>
+            <w:r>
+              <w:t>7.83</w:t>
+            </w:r>
+          </w:p>
+        </w:tc>
+        <w:tc>
+          <w:tcPr>
+            <w:tcW w:type="dxa" w:w="1440"/>
+          </w:tcPr>
+          <w:p>
+            <w:r>
+              <w:t>44.56</w:t>
+            </w:r>
+          </w:p>
+        </w:tc>
+      </w:tr>
+      <w:tr>
+        <w:tc>
+          <w:tcPr>
+            <w:tcW w:type="dxa" w:w="1440"/>
+          </w:tcPr>
+          <w:p>
+            <w:r>
+              <w:t>max</w:t>
+            </w:r>
+          </w:p>
+        </w:tc>
+        <w:tc>
+          <w:tcPr>
+            <w:tcW w:type="dxa" w:w="1440"/>
+          </w:tcPr>
+          <w:p>
+            <w:r>
+              <w:t>356.00</w:t>
+            </w:r>
+          </w:p>
+        </w:tc>
+        <w:tc>
+          <w:tcPr>
+            <w:tcW w:type="dxa" w:w="1440"/>
+          </w:tcPr>
+          <w:p>
+            <w:r>
+              <w:t>2,927.45</w:t>
+            </w:r>
+          </w:p>
+        </w:tc>
+        <w:tc>
+          <w:tcPr>
+            <w:tcW w:type="dxa" w:w="1440"/>
+          </w:tcPr>
+          <w:p>
+            <w:r>
+              <w:t>194.00</w:t>
+            </w:r>
+          </w:p>
+        </w:tc>
+        <w:tc>
+          <w:tcPr>
+            <w:tcW w:type="dxa" w:w="1440"/>
+          </w:tcPr>
+          <w:p>
+            <w:r>
+              <w:t>8.24</w:t>
+            </w:r>
+          </w:p>
+        </w:tc>
+        <w:tc>
+          <w:tcPr>
+            <w:tcW w:type="dxa" w:w="1440"/>
+          </w:tcPr>
+          <w:p>
+            <w:r>
+              <w:t>96.86</w:t>
+            </w:r>
+          </w:p>
+        </w:tc>
+      </w:tr>
+    </w:tbl>
+    <w:p>
+      <w:pPr>
+        <w:pStyle w:val="ListBullet"/>
+      </w:pPr>
+      <w:r>
+        <w:t>Budgets are tight: 125.0M to 356.0M with a median of 200.0M and no outliers at all. Money is uniformly large across this set.</w:t>
       </w:r>
     </w:p>
     <w:p>
       <w:pPr>
-        <w:jc w:val="center"/>
+        <w:pStyle w:val="ListBullet"/>
       </w:pPr>
+      <w:r>
+        <w:t>Revenue is right-skewed: median 1,484.54M against mean 1,699.04M, and Endgame (2,927.45M) and Avatar (2,923.71M) both sit past the 2,888.71M upper fence. The mean overstates a typical film here, which is why group comparisons quote the median.</w:t>
+      </w:r>
+    </w:p>
+    <w:p>
+      <w:pPr>
+        <w:pStyle w:val="ListBullet"/>
+      </w:pPr>
+      <w:r>
+        <w:t>Runtimes sit between 102 and 194 minutes with a median of 135.5. Only Titanic (194) and Endgame (181) blow the 180.9 fence - the two very long films are also the two biggest earners, a coincidence worth noticing rather than a rule.</w:t>
+      </w:r>
+    </w:p>
+    <w:p>
+      <w:pPr>
+        <w:pStyle w:val="ListBullet"/>
+      </w:pPr>
+      <w:r>
+        <w:t>Ratings barely move (6.50 to 8.24, zero outliers). Expected: the list is the brief's heavily-voted blockbusters, not a random sample of all films.</w:t>
+      </w:r>
+    </w:p>
+    <w:p>
+      <w:pPr>
+        <w:pStyle w:val="ListBullet"/>
+      </w:pPr>
+      <w:r>
+        <w:t>Popularity is the most skewed column: median 33.61 against a max of 96.86, with the two Avengers films (96.86 and 93.14) as the only outliers. Popularity measures release-window buzz, not long-run demand, so it gets read differently from ratings.</w:t>
+      </w:r>
+    </w:p>
+    <w:p>
       <w:r>
         <w:drawing>
           <wp:inline xmlns:a="http://schemas.openxmlformats.org/drawingml/2006/main" xmlns:pic="http://schemas.openxmlformats.org/drawingml/2006/picture">
@@ -1786,7 +2308,7 @@
               <a:graphicData uri="http://schemas.openxmlformats.org/drawingml/2006/picture">
                 <pic:pic>
                   <pic:nvPicPr>
-                    <pic:cNvPr id="0" name="chart1.png"/>
+                    <pic:cNvPr id="0" name="chart6.png"/>
                     <pic:cNvPicPr/>
                   </pic:nvPicPr>
                   <pic:blipFill>
@@ -1810,21 +2332,11 @@
       </w:r>
     </w:p>
     <w:p>
-      <w:pPr>
-        <w:jc w:val="center"/>
-      </w:pPr>
       <w:r>
-        <w:rPr>
-          <w:i/>
-          <w:sz w:val="18"/>
-        </w:rPr>
-        <w:t>Chart 1. Revenue against budget for the 18 films. The two sit off a diagonal, so bigger budget buys more revenue, but the spread at any budget is wide.</w:t>
+        <w:t>Chart 6. Distribution of revenue, median marked. The pile below ~1,500M with a long right tail is why the median gets quoted more than the mean.</w:t>
       </w:r>
     </w:p>
     <w:p>
-      <w:pPr>
-        <w:jc w:val="center"/>
-      </w:pPr>
       <w:r>
         <w:drawing>
           <wp:inline xmlns:a="http://schemas.openxmlformats.org/drawingml/2006/main" xmlns:pic="http://schemas.openxmlformats.org/drawingml/2006/picture">
@@ -1837,7 +2349,7 @@
               <a:graphicData uri="http://schemas.openxmlformats.org/drawingml/2006/picture">
                 <pic:pic>
                   <pic:nvPicPr>
-                    <pic:cNvPr id="0" name="chart2.png"/>
+                    <pic:cNvPr id="0" name="chart7.png"/>
                     <pic:cNvPicPr/>
                   </pic:nvPicPr>
                   <pic:blipFill>
@@ -1861,21 +2373,11 @@
       </w:r>
     </w:p>
     <w:p>
-      <w:pPr>
-        <w:jc w:val="center"/>
-      </w:pPr>
       <w:r>
-        <w:rPr>
-          <w:i/>
-          <w:sz w:val="18"/>
-        </w:rPr>
-        <w:t>Chart 2. Mean roi by genre, sorted, with the film count on each label. Read the n= first: Comedy and Crime rest on a single film, so those two bars are not a finding. Adventure, Science Fiction and Action are the only genres with a sample worth reading.</w:t>
+        <w:t>Chart 7. Distribution of popularity. Heavily right-skewed: one small cluster of films, the two Avengers entries, sits far above the pack.</w:t>
       </w:r>
     </w:p>
     <w:p>
-      <w:pPr>
-        <w:jc w:val="center"/>
-      </w:pPr>
       <w:r>
         <w:drawing>
           <wp:inline xmlns:a="http://schemas.openxmlformats.org/drawingml/2006/main" xmlns:pic="http://schemas.openxmlformats.org/drawingml/2006/picture">
@@ -1888,7 +2390,7 @@
               <a:graphicData uri="http://schemas.openxmlformats.org/drawingml/2006/picture">
                 <pic:pic>
                   <pic:nvPicPr>
-                    <pic:cNvPr id="0" name="chart3.png"/>
+                    <pic:cNvPr id="0" name="chart8.png"/>
                     <pic:cNvPicPr/>
                   </pic:nvPicPr>
                   <pic:blipFill>
@@ -1912,21 +2414,19 @@
       </w:r>
     </w:p>
     <w:p>
-      <w:pPr>
-        <w:jc w:val="center"/>
-      </w:pPr>
       <w:r>
-        <w:rPr>
-          <w:i/>
-          <w:sz w:val="18"/>
-        </w:rPr>
-        <w:t>Chart 3. Popularity against rating. The two barely move together, so TMDB popularity is not a proxy for quality.</w:t>
+        <w:t>Chart 8. Boxplot of runtime. Whiskers reach ~102 and ~181 minutes; Titanic and Endgame are the two plotted outlier points.</w:t>
       </w:r>
     </w:p>
     <w:p>
       <w:pPr>
-        <w:jc w:val="center"/>
+        <w:pStyle w:val="Heading1"/>
       </w:pPr>
+      <w:r>
+        <w:t>8. Visualizations</w:t>
+      </w:r>
+    </w:p>
+    <w:p>
       <w:r>
         <w:drawing>
           <wp:inline xmlns:a="http://schemas.openxmlformats.org/drawingml/2006/main" xmlns:pic="http://schemas.openxmlformats.org/drawingml/2006/picture">
@@ -1939,7 +2439,7 @@
               <a:graphicData uri="http://schemas.openxmlformats.org/drawingml/2006/picture">
                 <pic:pic>
                   <pic:nvPicPr>
-                    <pic:cNvPr id="0" name="chart4.png"/>
+                    <pic:cNvPr id="0" name="chart1.png"/>
                     <pic:cNvPicPr/>
                   </pic:nvPicPr>
                   <pic:blipFill>
@@ -1963,21 +2463,11 @@
       </w:r>
     </w:p>
     <w:p>
-      <w:pPr>
-        <w:jc w:val="center"/>
-      </w:pPr>
       <w:r>
-        <w:rPr>
-          <w:i/>
-          <w:sz w:val="18"/>
-        </w:rPr>
-        <w:t>Chart 4. Mean revenue per release year. The set is chosen by box office, so later years look stronger purely because of selection.</w:t>
+        <w:t>Chart 1. Revenue against budget for the 18 films. The two sit off a diagonal, so bigger budget buys more revenue, but the spread at any budget is wide.</w:t>
       </w:r>
     </w:p>
     <w:p>
-      <w:pPr>
-        <w:jc w:val="center"/>
-      </w:pPr>
       <w:r>
         <w:drawing>
           <wp:inline xmlns:a="http://schemas.openxmlformats.org/drawingml/2006/main" xmlns:pic="http://schemas.openxmlformats.org/drawingml/2006/picture">
@@ -1990,7 +2480,7 @@
               <a:graphicData uri="http://schemas.openxmlformats.org/drawingml/2006/picture">
                 <pic:pic>
                   <pic:nvPicPr>
-                    <pic:cNvPr id="0" name="chart5.png"/>
+                    <pic:cNvPr id="0" name="chart2.png"/>
                     <pic:cNvPicPr/>
                   </pic:nvPicPr>
                   <pic:blipFill>
@@ -2014,14 +2504,130 @@
       </w:r>
     </w:p>
     <w:p>
-      <w:pPr>
-        <w:jc w:val="center"/>
-      </w:pPr>
       <w:r>
-        <w:rPr>
-          <w:i/>
-          <w:sz w:val="18"/>
-        </w:rPr>
+        <w:t>Chart 2. Mean roi by genre, sorted, with the film count on each label. Read the n= first: Comedy and Crime rest on a single film, so those two bars are not a finding. Adventure, Science Fiction and Action are the only genres with a sample worth reading.</w:t>
+      </w:r>
+    </w:p>
+    <w:p>
+      <w:r>
+        <w:drawing>
+          <wp:inline xmlns:a="http://schemas.openxmlformats.org/drawingml/2006/main" xmlns:pic="http://schemas.openxmlformats.org/drawingml/2006/picture">
+            <wp:extent cx="5394960" cy="4046220"/>
+            <wp:docPr id="6" name="Picture 6"/>
+            <wp:cNvGraphicFramePr>
+              <a:graphicFrameLocks noChangeAspect="1"/>
+            </wp:cNvGraphicFramePr>
+            <a:graphic>
+              <a:graphicData uri="http://schemas.openxmlformats.org/drawingml/2006/picture">
+                <pic:pic>
+                  <pic:nvPicPr>
+                    <pic:cNvPr id="0" name="chart3.png"/>
+                    <pic:cNvPicPr/>
+                  </pic:nvPicPr>
+                  <pic:blipFill>
+                    <a:blip r:embed="rId14"/>
+                    <a:stretch>
+                      <a:fillRect/>
+                    </a:stretch>
+                  </pic:blipFill>
+                  <pic:spPr>
+                    <a:xfrm>
+                      <a:off x="0" y="0"/>
+                      <a:ext cx="5394960" cy="4046220"/>
+                    </a:xfrm>
+                    <a:prstGeom prst="rect"/>
+                  </pic:spPr>
+                </pic:pic>
+              </a:graphicData>
+            </a:graphic>
+          </wp:inline>
+        </w:drawing>
+      </w:r>
+    </w:p>
+    <w:p>
+      <w:r>
+        <w:t>Chart 3. Popularity against rating. The two barely move together, so TMDB popularity is not a proxy for quality.</w:t>
+      </w:r>
+    </w:p>
+    <w:p>
+      <w:r>
+        <w:drawing>
+          <wp:inline xmlns:a="http://schemas.openxmlformats.org/drawingml/2006/main" xmlns:pic="http://schemas.openxmlformats.org/drawingml/2006/picture">
+            <wp:extent cx="5394960" cy="4046220"/>
+            <wp:docPr id="7" name="Picture 7"/>
+            <wp:cNvGraphicFramePr>
+              <a:graphicFrameLocks noChangeAspect="1"/>
+            </wp:cNvGraphicFramePr>
+            <a:graphic>
+              <a:graphicData uri="http://schemas.openxmlformats.org/drawingml/2006/picture">
+                <pic:pic>
+                  <pic:nvPicPr>
+                    <pic:cNvPr id="0" name="chart4.png"/>
+                    <pic:cNvPicPr/>
+                  </pic:nvPicPr>
+                  <pic:blipFill>
+                    <a:blip r:embed="rId15"/>
+                    <a:stretch>
+                      <a:fillRect/>
+                    </a:stretch>
+                  </pic:blipFill>
+                  <pic:spPr>
+                    <a:xfrm>
+                      <a:off x="0" y="0"/>
+                      <a:ext cx="5394960" cy="4046220"/>
+                    </a:xfrm>
+                    <a:prstGeom prst="rect"/>
+                  </pic:spPr>
+                </pic:pic>
+              </a:graphicData>
+            </a:graphic>
+          </wp:inline>
+        </w:drawing>
+      </w:r>
+    </w:p>
+    <w:p>
+      <w:r>
+        <w:t>Chart 4. Mean revenue per release year. The set is chosen by box office, so later years look stronger purely because of selection.</w:t>
+      </w:r>
+    </w:p>
+    <w:p>
+      <w:r>
+        <w:drawing>
+          <wp:inline xmlns:a="http://schemas.openxmlformats.org/drawingml/2006/main" xmlns:pic="http://schemas.openxmlformats.org/drawingml/2006/picture">
+            <wp:extent cx="5394960" cy="4046220"/>
+            <wp:docPr id="8" name="Picture 8"/>
+            <wp:cNvGraphicFramePr>
+              <a:graphicFrameLocks noChangeAspect="1"/>
+            </wp:cNvGraphicFramePr>
+            <a:graphic>
+              <a:graphicData uri="http://schemas.openxmlformats.org/drawingml/2006/picture">
+                <pic:pic>
+                  <pic:nvPicPr>
+                    <pic:cNvPr id="0" name="chart5.png"/>
+                    <pic:cNvPicPr/>
+                  </pic:nvPicPr>
+                  <pic:blipFill>
+                    <a:blip r:embed="rId16"/>
+                    <a:stretch>
+                      <a:fillRect/>
+                    </a:stretch>
+                  </pic:blipFill>
+                  <pic:spPr>
+                    <a:xfrm>
+                      <a:off x="0" y="0"/>
+                      <a:ext cx="5394960" cy="4046220"/>
+                    </a:xfrm>
+                    <a:prstGeom prst="rect"/>
+                  </pic:spPr>
+                </pic:pic>
+              </a:graphicData>
+            </a:graphic>
+          </wp:inline>
+        </w:drawing>
+      </w:r>
+    </w:p>
+    <w:p>
+      <w:r>
         <w:t>Chart 5. Mean revenue, franchise against standalone. Standalones edge it, but there are only two of them against sixteen.</w:t>
       </w:r>
     </w:p>
@@ -2030,7 +2636,7 @@
         <w:pStyle w:val="Heading1"/>
       </w:pPr>
       <w:r>
-        <w:t>8. Limitations</w:t>
+        <w:t>9. Limitations</w:t>
       </w:r>
     </w:p>
     <w:p>
@@ -2078,31 +2684,29 @@
         <w:pStyle w:val="Heading1"/>
       </w:pPr>
       <w:r>
-        <w:t>9. How to run it again</w:t>
+        <w:t>10. How to run it again</w:t>
       </w:r>
     </w:p>
     <w:p>
       <w:r>
-        <w:rPr>
-          <w:rFonts w:ascii="Consolas" w:hAnsi="Consolas"/>
-          <w:sz w:val="19"/>
-        </w:rPr>
         <w:t>pip install -r requirements.txt</w:t>
         <w:br/>
         <w:t>copy .env.example to .env and put your key in</w:t>
         <w:br/>
         <w:t>pytest</w:t>
         <w:br/>
-        <w:t>python tmdb_client.py</w:t>
+        <w:t>python -m src.tmdb_client  (saves data/raw_movies.json)</w:t>
         <w:br/>
-        <w:t>python app/main.py</w:t>
+        <w:t>python -m src.main  (prints the clean table shape and the profit head)</w:t>
+        <w:br/>
+        <w:t>python -m src.build_report  (rebuilds this docx)</w:t>
         <w:br/>
         <w:t>open analysis.ipynb and run it top to bottom</w:t>
       </w:r>
     </w:p>
     <w:sectPr>
       <w:pgSz w:w="12240" w:h="15840"/>
-      <w:pgMar w:top="1440" w:right="1224" w:bottom="1440" w:left="1224" w:header="720" w:footer="720" w:gutter="0"/>
+      <w:pgMar w:top="1440" w:right="1800" w:bottom="1440" w:left="1800" w:header="720" w:footer="720" w:gutter="0"/>
       <w:cols w:space="720"/>
       <w:docGrid w:linePitch="360"/>
     </w:sectPr>
@@ -2473,10 +3077,6 @@
     <w:name w:val="Normal"/>
     <w:qFormat/>
     <w:rsid w:val="00FC693F"/>
-    <w:rPr>
-      <w:rFonts w:ascii="Calibri" w:hAnsi="Calibri"/>
-      <w:sz w:val="21"/>
-    </w:rPr>
   </w:style>
   <w:style w:type="paragraph" w:styleId="Header">
     <w:name w:val="header"/>

</xml_diff>